<commit_message>
Post-audit improvements: anaphora fix on by default, learned controller option, CPU thread fix, local LLM client; refresh docs and Docker
</commit_message>
<xml_diff>
--- a/docs/architecture_brief.docx
+++ b/docs/architecture_brief.docx
@@ -2627,37 +2627,7 @@
                 <w:szCs w:val="16"/>
                 <w:shd w:fill="EEF0F3" w:color="auto" w:val="clear"/>
               </w:rPr>
-              <w:t xml:space="preserve">controller.mode=model</w:t>
-            </w:r>
-            <w:r>
-              <w:rPr>
-                <w:rFonts w:ascii="Calibri" w:cs="Calibri" w:eastAsia="Calibri" w:hAnsi="Calibri"/>
-                <w:b w:val="false"/>
-                <w:bCs w:val="false"/>
-                <w:sz w:val="18"/>
-                <w:szCs w:val="18"/>
-              </w:rPr>
-              <w:t xml:space="preserve"> is </w:t>
-            </w:r>
-            <w:r>
-              <w:rPr>
-                <w:rFonts w:ascii="Calibri" w:cs="Calibri" w:eastAsia="Calibri" w:hAnsi="Calibri"/>
-                <w:b/>
-                <w:bCs/>
-                <w:sz w:val="18"/>
-                <w:szCs w:val="18"/>
-              </w:rPr>
-              <w:t xml:space="preserve">not implemented</w:t>
-            </w:r>
-            <w:r>
-              <w:rPr>
-                <w:rFonts w:ascii="Calibri" w:cs="Calibri" w:eastAsia="Calibri" w:hAnsi="Calibri"/>
-                <w:b w:val="false"/>
-                <w:bCs w:val="false"/>
-                <w:sz w:val="18"/>
-                <w:szCs w:val="18"/>
-              </w:rPr>
-              <w:t xml:space="preserve"> (rejected at build time), so the rule-vs-model ablation was not run; it needs an LLM key</w:t>
+              <w:t>controller.mode=model is a learned stability classifier (off by default: no accuracy gain worth its 0.5-0.8 pt loss of early retrieval); an LLM-driven controller (hybrid / llm) is not implemented (rejected at build time)</w:t>
             </w:r>
           </w:p>
         </w:tc>

</xml_diff>